<commit_message>
docs: add English versions of the two finance-research skills
Translate the skill specs only. Keep the same rules, code, and sample rows.
Point the English resume portfolio at the English skill file.

Co-authored-by: invy95 <invy95@users.noreply.github.com>
</commit_message>
<xml_diff>
--- a/resume/YinWei_Resume_EN.docx
+++ b/resume/YinWei_Resume_EN.docx
@@ -1283,7 +1283,7 @@
           <w:b w:val="0"/>
           <w:sz w:val="17"/>
         </w:rPr>
-        <w:t xml:space="preserve">Financial investment-research Skills: </w:t>
+        <w:t xml:space="preserve">Investment-research Skills (English): </w:t>
       </w:r>
       <w:hyperlink r:id="rId9">
         <w:r>
@@ -1294,7 +1294,7 @@
             <w:color w:val="0563C1"/>
             <w:u w:val="single"/>
           </w:rPr>
-          <w:t xml:space="preserve">https://github.com/invy95/myCode/raw/cursor/skills-public-6afc/Finance_Research_Skills.docx</w:t>
+          <w:t xml:space="preserve">https://github.com/invy95/myCode/raw/cursor/skills-public-6afc/Finance_Research_Skills_EN.docx</w:t>
         </w:r>
       </w:hyperlink>
     </w:p>

</xml_diff>